<commit_message>
Fix referencia inexistente: Sen et al 2024 reemplazada por Camara et al 2024 en caps 2-6, bibliografia y consolidada v5
</commit_message>
<xml_diff>
--- a/textos/CFH_Referencias_Consolidadas_APA7.docx
+++ b/textos/CFH_Referencias_Consolidadas_APA7.docx
@@ -49,7 +49,7 @@
           <w:sz w:val="20"/>
           <w:szCs w:val="20"/>
         </w:rPr>
-        <w:t xml:space="preserve">Bibliografía consolidada de la tesis · formato APA 7 · 72 referencias</w:t>
+        <w:t xml:space="preserve">Bibliografía consolidada de la tesis · formato APA 7 · 76 referencias</w:t>
       </w:r>
     </w:p>
     <w:p>
@@ -235,6 +235,30 @@
           <w:sz w:val="21"/>
           <w:szCs w:val="21"/>
         </w:rPr>
+        <w:t xml:space="preserve">Camara, M. K., Postal, A., Maul, T. H., y Paetzold, G. H. (2024). Can lies be faked? Comparing low-stakes and high-stakes deception video datasets from a Machine Learning perspective. Expert Systems with Applications, 249, 123684. </w:t>
+      </w:r>
+      <w:r>
+        <w:rPr>
+          <w:rFonts w:ascii="Arial" w:cs="Arial" w:eastAsia="Arial" w:hAnsi="Arial"/>
+          <w:color w:val="2A6099"/>
+          <w:sz w:val="21"/>
+          <w:szCs w:val="21"/>
+        </w:rPr>
+        <w:t xml:space="preserve">https://doi.org/10.1016/j.eswa.2024.123684</w:t>
+      </w:r>
+    </w:p>
+    <w:p>
+      <w:pPr>
+        <w:spacing w:after="140" w:line="300"/>
+        <w:ind w:left="567" w:hanging="567"/>
+        <w:jc w:val="both"/>
+      </w:pPr>
+      <w:r>
+        <w:rPr>
+          <w:rFonts w:ascii="Arial" w:cs="Arial" w:eastAsia="Arial" w:hAnsi="Arial"/>
+          <w:sz w:val="21"/>
+          <w:szCs w:val="21"/>
+        </w:rPr>
         <w:t xml:space="preserve">Cañete, J., Chaperon, G., Fuentes, R., Ho, J.-H., Kang, H., y Pérez, J. (2020). Spanish pre-trained BERT model and evaluation data. PML4DC Workshop at ICLR 2020.</w:t>
       </w:r>
     </w:p>
@@ -295,6 +319,21 @@
           <w:sz w:val="21"/>
           <w:szCs w:val="21"/>
         </w:rPr>
+        <w:t xml:space="preserve">CINEP/Programa por la Paz. (2020). Banco de datos de derechos humanos y violencia política. Centro de Investigación y Educación Popular.</w:t>
+      </w:r>
+    </w:p>
+    <w:p>
+      <w:pPr>
+        <w:spacing w:after="140" w:line="300"/>
+        <w:ind w:left="567" w:hanging="567"/>
+        <w:jc w:val="both"/>
+      </w:pPr>
+      <w:r>
+        <w:rPr>
+          <w:rFonts w:ascii="Arial" w:cs="Arial" w:eastAsia="Arial" w:hAnsi="Arial"/>
+          <w:sz w:val="21"/>
+          <w:szCs w:val="21"/>
+        </w:rPr>
         <w:t xml:space="preserve">Clark, P. (2010). The Gacaca courts, post-genocide justice and reconciliation in Rwanda. Cambridge University Press.</w:t>
       </w:r>
     </w:p>
@@ -310,6 +349,21 @@
           <w:sz w:val="21"/>
           <w:szCs w:val="21"/>
         </w:rPr>
+        <w:t xml:space="preserve">CNMH — Centro Nacional de Memoria Histórica. (2019). Mujeres y madres: Memorias de los falsos positivos. CNMH.</w:t>
+      </w:r>
+    </w:p>
+    <w:p>
+      <w:pPr>
+        <w:spacing w:after="140" w:line="300"/>
+        <w:ind w:left="567" w:hanging="567"/>
+        <w:jc w:val="both"/>
+      </w:pPr>
+      <w:r>
+        <w:rPr>
+          <w:rFonts w:ascii="Arial" w:cs="Arial" w:eastAsia="Arial" w:hAnsi="Arial"/>
+          <w:sz w:val="21"/>
+          <w:szCs w:val="21"/>
+        </w:rPr>
         <w:t xml:space="preserve">Comisión de la Verdad. (2022). Hay futuro si hay verdad: Informe final. Comisión para el Esclarecimiento de la Verdad, la Convivencia y la No Repetición.</w:t>
       </w:r>
     </w:p>
@@ -739,6 +793,21 @@
           <w:sz w:val="21"/>
           <w:szCs w:val="21"/>
         </w:rPr>
+        <w:t xml:space="preserve">ICC — International Criminal Court, Office of the Prosecutor. (2020). Situation in Colombia: Preliminary examination. Corte Penal Internacional.</w:t>
+      </w:r>
+    </w:p>
+    <w:p>
+      <w:pPr>
+        <w:spacing w:after="140" w:line="300"/>
+        <w:ind w:left="567" w:hanging="567"/>
+        <w:jc w:val="both"/>
+      </w:pPr>
+      <w:r>
+        <w:rPr>
+          <w:rFonts w:ascii="Arial" w:cs="Arial" w:eastAsia="Arial" w:hAnsi="Arial"/>
+          <w:sz w:val="21"/>
+          <w:szCs w:val="21"/>
+        </w:rPr>
         <w:t xml:space="preserve">Igolkina, A. A., y Meshcheryakov, G. (2020). semopy: A Python package for structural equation modeling. Structural Equation Modeling, 27(6), 952–963. </w:t>
       </w:r>
       <w:r>
@@ -1096,6 +1165,21 @@
           <w:sz w:val="21"/>
           <w:szCs w:val="21"/>
         </w:rPr>
+        <w:t xml:space="preserve">OACNUDH. (2010). Informe del Relator Especial sobre las ejecuciones extrajudiciales, sumarias o arbitrarias: Misión a Colombia (A/HRC/14/24/Add.2). Oficina del Alto Comisionado de las Naciones Unidas para los Derechos Humanos.</w:t>
+      </w:r>
+    </w:p>
+    <w:p>
+      <w:pPr>
+        <w:spacing w:after="140" w:line="300"/>
+        <w:ind w:left="567" w:hanging="567"/>
+        <w:jc w:val="both"/>
+      </w:pPr>
+      <w:r>
+        <w:rPr>
+          <w:rFonts w:ascii="Arial" w:cs="Arial" w:eastAsia="Arial" w:hAnsi="Arial"/>
+          <w:sz w:val="21"/>
+          <w:szCs w:val="21"/>
+        </w:rPr>
         <w:t xml:space="preserve">Páez, A., y Matida, J. (2022). La injusticia epistémica en el proceso penal. Estudios de Filosofía, 65, 5–25.</w:t>
       </w:r>
     </w:p>
@@ -1247,30 +1331,6 @@
           <w:szCs w:val="21"/>
         </w:rPr>
         <w:t xml:space="preserve">Searle, J. R. (1969). Speech acts: An essay in the philosophy of language. Cambridge University Press.</w:t>
-      </w:r>
-    </w:p>
-    <w:p>
-      <w:pPr>
-        <w:spacing w:after="140" w:line="300"/>
-        <w:ind w:left="567" w:hanging="567"/>
-        <w:jc w:val="both"/>
-      </w:pPr>
-      <w:r>
-        <w:rPr>
-          <w:rFonts w:ascii="Arial" w:cs="Arial" w:eastAsia="Arial" w:hAnsi="Arial"/>
-          <w:sz w:val="21"/>
-          <w:szCs w:val="21"/>
-        </w:rPr>
-        <w:t xml:space="preserve">Sen, S., Singh, G., y Varshney, P. (2024). Deception detection using machine learning: A systematic review and transfer learning limitations from low-stakes to high-stakes. Expert Systems with Applications, 213, 119048. </w:t>
-      </w:r>
-      <w:r>
-        <w:rPr>
-          <w:rFonts w:ascii="Arial" w:cs="Arial" w:eastAsia="Arial" w:hAnsi="Arial"/>
-          <w:color w:val="2A6099"/>
-          <w:sz w:val="21"/>
-          <w:szCs w:val="21"/>
-        </w:rPr>
-        <w:t xml:space="preserve">https://doi.org/10.1016/j.eswa.2022.119048</w:t>
       </w:r>
     </w:p>
     <w:p>

</xml_diff>